<commit_message>
Add project report with 6 figures: training curve, confusion matrix, web UI screenshots, GitHub repo
</commit_message>
<xml_diff>
--- a/实训项目报告.docx
+++ b/实训项目报告.docx
@@ -1121,6 +1121,59 @@
     <w:p/>
     <w:p>
       <w:pPr>
+        <w:jc w:val="center"/>
+      </w:pPr>
+      <w:r>
+        <w:drawing>
+          <wp:inline xmlns:a="http://schemas.openxmlformats.org/drawingml/2006/main" xmlns:pic="http://schemas.openxmlformats.org/drawingml/2006/picture">
+            <wp:extent cx="5029200" cy="2794000"/>
+            <wp:docPr id="6" name="Picture 6"/>
+            <wp:cNvGraphicFramePr>
+              <a:graphicFrameLocks noChangeAspect="1"/>
+            </wp:cNvGraphicFramePr>
+            <a:graphic>
+              <a:graphicData uri="http://schemas.openxmlformats.org/drawingml/2006/picture">
+                <pic:pic>
+                  <pic:nvPicPr>
+                    <pic:cNvPr id="0" name="training_curve.png"/>
+                    <pic:cNvPicPr/>
+                  </pic:nvPicPr>
+                  <pic:blipFill>
+                    <a:blip r:embed="rId12"/>
+                    <a:stretch>
+                      <a:fillRect/>
+                    </a:stretch>
+                  </pic:blipFill>
+                  <pic:spPr>
+                    <a:xfrm>
+                      <a:off x="0" y="0"/>
+                      <a:ext cx="5029200" cy="2794000"/>
+                    </a:xfrm>
+                    <a:prstGeom prst="rect"/>
+                  </pic:spPr>
+                </pic:pic>
+              </a:graphicData>
+            </a:graphic>
+          </wp:inline>
+        </w:drawing>
+      </w:r>
+    </w:p>
+    <w:p>
+      <w:pPr>
+        <w:jc w:val="center"/>
+      </w:pPr>
+      <w:r>
+        <w:rPr>
+          <w:rFonts w:ascii="宋体" w:hAnsi="宋体" w:eastAsia="宋体"/>
+          <w:color w:val="646464"/>
+          <w:sz w:val="20"/>
+        </w:rPr>
+        <w:t>图1: 训练Loss与准确率曲线（30 Epochs）</w:t>
+      </w:r>
+    </w:p>
+    <w:p/>
+    <w:p>
+      <w:pPr>
         <w:spacing w:line="312" w:lineRule="auto" w:before="0" w:after="60"/>
         <w:ind w:firstLine="420"/>
       </w:pPr>
@@ -1190,6 +1243,218 @@
     </w:p>
     <w:p>
       <w:pPr>
+        <w:jc w:val="center"/>
+      </w:pPr>
+      <w:r>
+        <w:drawing>
+          <wp:inline xmlns:a="http://schemas.openxmlformats.org/drawingml/2006/main" xmlns:pic="http://schemas.openxmlformats.org/drawingml/2006/picture">
+            <wp:extent cx="4572000" cy="5070763"/>
+            <wp:docPr id="7" name="Picture 7"/>
+            <wp:cNvGraphicFramePr>
+              <a:graphicFrameLocks noChangeAspect="1"/>
+            </wp:cNvGraphicFramePr>
+            <a:graphic>
+              <a:graphicData uri="http://schemas.openxmlformats.org/drawingml/2006/picture">
+                <pic:pic>
+                  <pic:nvPicPr>
+                    <pic:cNvPr id="0" name="confusion_matrix.png"/>
+                    <pic:cNvPicPr/>
+                  </pic:nvPicPr>
+                  <pic:blipFill>
+                    <a:blip r:embed="rId13"/>
+                    <a:stretch>
+                      <a:fillRect/>
+                    </a:stretch>
+                  </pic:blipFill>
+                  <pic:spPr>
+                    <a:xfrm>
+                      <a:off x="0" y="0"/>
+                      <a:ext cx="4572000" cy="5070763"/>
+                    </a:xfrm>
+                    <a:prstGeom prst="rect"/>
+                  </pic:spPr>
+                </pic:pic>
+              </a:graphicData>
+            </a:graphic>
+          </wp:inline>
+        </w:drawing>
+      </w:r>
+    </w:p>
+    <w:p>
+      <w:pPr>
+        <w:jc w:val="center"/>
+      </w:pPr>
+      <w:r>
+        <w:rPr>
+          <w:rFonts w:ascii="宋体" w:hAnsi="宋体" w:eastAsia="宋体"/>
+          <w:color w:val="646464"/>
+          <w:sz w:val="20"/>
+        </w:rPr>
+        <w:t>图2: 混淆矩阵（测试集480张，准确率97.08%）</w:t>
+      </w:r>
+    </w:p>
+    <w:p/>
+    <w:p>
+      <w:pPr>
+        <w:jc w:val="center"/>
+      </w:pPr>
+      <w:r>
+        <w:drawing>
+          <wp:inline xmlns:a="http://schemas.openxmlformats.org/drawingml/2006/main" xmlns:pic="http://schemas.openxmlformats.org/drawingml/2006/picture">
+            <wp:extent cx="4572000" cy="2612571"/>
+            <wp:docPr id="8" name="Picture 8"/>
+            <wp:cNvGraphicFramePr>
+              <a:graphicFrameLocks noChangeAspect="1"/>
+            </wp:cNvGraphicFramePr>
+            <a:graphic>
+              <a:graphicData uri="http://schemas.openxmlformats.org/drawingml/2006/picture">
+                <pic:pic>
+                  <pic:nvPicPr>
+                    <pic:cNvPr id="0" name="class_accuracy.png"/>
+                    <pic:cNvPicPr/>
+                  </pic:nvPicPr>
+                  <pic:blipFill>
+                    <a:blip r:embed="rId14"/>
+                    <a:stretch>
+                      <a:fillRect/>
+                    </a:stretch>
+                  </pic:blipFill>
+                  <pic:spPr>
+                    <a:xfrm>
+                      <a:off x="0" y="0"/>
+                      <a:ext cx="4572000" cy="2612571"/>
+                    </a:xfrm>
+                    <a:prstGeom prst="rect"/>
+                  </pic:spPr>
+                </pic:pic>
+              </a:graphicData>
+            </a:graphic>
+          </wp:inline>
+        </w:drawing>
+      </w:r>
+    </w:p>
+    <w:p>
+      <w:pPr>
+        <w:jc w:val="center"/>
+      </w:pPr>
+      <w:r>
+        <w:rPr>
+          <w:rFonts w:ascii="宋体" w:hAnsi="宋体" w:eastAsia="宋体"/>
+          <w:color w:val="646464"/>
+          <w:sz w:val="20"/>
+        </w:rPr>
+        <w:t>图3: 各类别测试准确率</w:t>
+      </w:r>
+    </w:p>
+    <w:p/>
+    <w:p>
+      <w:pPr>
+        <w:jc w:val="center"/>
+      </w:pPr>
+      <w:r>
+        <w:drawing>
+          <wp:inline xmlns:a="http://schemas.openxmlformats.org/drawingml/2006/main" xmlns:pic="http://schemas.openxmlformats.org/drawingml/2006/picture">
+            <wp:extent cx="4572000" cy="4792043"/>
+            <wp:docPr id="9" name="Picture 9"/>
+            <wp:cNvGraphicFramePr>
+              <a:graphicFrameLocks noChangeAspect="1"/>
+            </wp:cNvGraphicFramePr>
+            <a:graphic>
+              <a:graphicData uri="http://schemas.openxmlformats.org/drawingml/2006/picture">
+                <pic:pic>
+                  <pic:nvPicPr>
+                    <pic:cNvPr id="0" name="web_camera.png"/>
+                    <pic:cNvPicPr/>
+                  </pic:nvPicPr>
+                  <pic:blipFill>
+                    <a:blip r:embed="rId15"/>
+                    <a:stretch>
+                      <a:fillRect/>
+                    </a:stretch>
+                  </pic:blipFill>
+                  <pic:spPr>
+                    <a:xfrm>
+                      <a:off x="0" y="0"/>
+                      <a:ext cx="4572000" cy="4792043"/>
+                    </a:xfrm>
+                    <a:prstGeom prst="rect"/>
+                  </pic:spPr>
+                </pic:pic>
+              </a:graphicData>
+            </a:graphic>
+          </wp:inline>
+        </w:drawing>
+      </w:r>
+    </w:p>
+    <w:p>
+      <w:pPr>
+        <w:jc w:val="center"/>
+      </w:pPr>
+      <w:r>
+        <w:rPr>
+          <w:rFonts w:ascii="宋体" w:hAnsi="宋体" w:eastAsia="宋体"/>
+          <w:color w:val="646464"/>
+          <w:sz w:val="20"/>
+        </w:rPr>
+        <w:t>图4: 摄像头实时识别界面</w:t>
+      </w:r>
+    </w:p>
+    <w:p/>
+    <w:p>
+      <w:pPr>
+        <w:jc w:val="center"/>
+      </w:pPr>
+      <w:r>
+        <w:drawing>
+          <wp:inline xmlns:a="http://schemas.openxmlformats.org/drawingml/2006/main" xmlns:pic="http://schemas.openxmlformats.org/drawingml/2006/picture">
+            <wp:extent cx="4572000" cy="9733422"/>
+            <wp:docPr id="10" name="Picture 10"/>
+            <wp:cNvGraphicFramePr>
+              <a:graphicFrameLocks noChangeAspect="1"/>
+            </wp:cNvGraphicFramePr>
+            <a:graphic>
+              <a:graphicData uri="http://schemas.openxmlformats.org/drawingml/2006/picture">
+                <pic:pic>
+                  <pic:nvPicPr>
+                    <pic:cNvPr id="0" name="web_upload.png"/>
+                    <pic:cNvPicPr/>
+                  </pic:nvPicPr>
+                  <pic:blipFill>
+                    <a:blip r:embed="rId16"/>
+                    <a:stretch>
+                      <a:fillRect/>
+                    </a:stretch>
+                  </pic:blipFill>
+                  <pic:spPr>
+                    <a:xfrm>
+                      <a:off x="0" y="0"/>
+                      <a:ext cx="4572000" cy="9733422"/>
+                    </a:xfrm>
+                    <a:prstGeom prst="rect"/>
+                  </pic:spPr>
+                </pic:pic>
+              </a:graphicData>
+            </a:graphic>
+          </wp:inline>
+        </w:drawing>
+      </w:r>
+    </w:p>
+    <w:p>
+      <w:pPr>
+        <w:jc w:val="center"/>
+      </w:pPr>
+      <w:r>
+        <w:rPr>
+          <w:rFonts w:ascii="宋体" w:hAnsi="宋体" w:eastAsia="宋体"/>
+          <w:color w:val="646464"/>
+          <w:sz w:val="20"/>
+        </w:rPr>
+        <w:t>图5: 图片上传识别界面</w:t>
+      </w:r>
+    </w:p>
+    <w:p/>
+    <w:p>
+      <w:pPr>
         <w:spacing w:line="312" w:lineRule="auto" w:before="160" w:after="80"/>
       </w:pPr>
       <w:r>
@@ -1292,6 +1557,59 @@
         <w:t>（6）prepare_kaggle.py - 外部数据预处理：解析Kaggle数据集文件名中的标签信息，生成统一格式的训练标注文件。</w:t>
       </w:r>
     </w:p>
+    <w:p>
+      <w:pPr>
+        <w:jc w:val="center"/>
+      </w:pPr>
+      <w:r>
+        <w:drawing>
+          <wp:inline xmlns:a="http://schemas.openxmlformats.org/drawingml/2006/main" xmlns:pic="http://schemas.openxmlformats.org/drawingml/2006/picture">
+            <wp:extent cx="4572000" cy="2687091"/>
+            <wp:docPr id="11" name="Picture 11"/>
+            <wp:cNvGraphicFramePr>
+              <a:graphicFrameLocks noChangeAspect="1"/>
+            </wp:cNvGraphicFramePr>
+            <a:graphic>
+              <a:graphicData uri="http://schemas.openxmlformats.org/drawingml/2006/picture">
+                <pic:pic>
+                  <pic:nvPicPr>
+                    <pic:cNvPr id="0" name="github_repo.png"/>
+                    <pic:cNvPicPr/>
+                  </pic:nvPicPr>
+                  <pic:blipFill>
+                    <a:blip r:embed="rId17"/>
+                    <a:stretch>
+                      <a:fillRect/>
+                    </a:stretch>
+                  </pic:blipFill>
+                  <pic:spPr>
+                    <a:xfrm>
+                      <a:off x="0" y="0"/>
+                      <a:ext cx="4572000" cy="2687091"/>
+                    </a:xfrm>
+                    <a:prstGeom prst="rect"/>
+                  </pic:spPr>
+                </pic:pic>
+              </a:graphicData>
+            </a:graphic>
+          </wp:inline>
+        </w:drawing>
+      </w:r>
+    </w:p>
+    <w:p>
+      <w:pPr>
+        <w:jc w:val="center"/>
+      </w:pPr>
+      <w:r>
+        <w:rPr>
+          <w:rFonts w:ascii="宋体" w:hAnsi="宋体" w:eastAsia="宋体"/>
+          <w:color w:val="646464"/>
+          <w:sz w:val="20"/>
+        </w:rPr>
+        <w:t>图6: GitHub代码仓库</w:t>
+      </w:r>
+    </w:p>
+    <w:p/>
     <w:p>
       <w:pPr>
         <w:spacing w:line="312" w:lineRule="auto" w:before="0" w:after="60"/>

</xml_diff>